<commit_message>
Add calculation glossary to project documentation
Add an appendix with a glossary of financial calculation terms to the Indonesian and English documentation files, including definitions, formulas, and examples.

Replit-Commit-Author: Agent
Replit-Commit-Session-Id: 0226671d-4d7c-40eb-9b18-8775578e8874
Replit-Commit-Checkpoint-Type: full_checkpoint
Replit-Commit-Event-Id: b512ba81-06ae-4e8d-89ff-9e034820c6a0
Replit-Commit-Screenshot-Url: https://storage.googleapis.com/screenshot-production-us-central1/c82b66a8-f4a7-47f1-bdbd-9ebba5cc2312/0226671d-4d7c-40eb-9b18-8775578e8874/srlNYvE
Replit-Helium-Checkpoint-Created: true
</commit_message>
<xml_diff>
--- a/exports/SecureProfit-Hub-Features-and-Calculations-EN.docx
+++ b/exports/SecureProfit-Hub-Features-and-Calculations-EN.docx
@@ -6130,6 +6130,1324 @@
           <w:szCs w:val="22"/>
         </w:rPr>
         <w:t xml:space="preserve">"Each role only sees what is relevant — financials are protected from the delivery team."</w:t>
+      </w:r>
+    </w:p>
+    <w:p>
+      <w:r>
+        <w:br w:type="page"/>
+      </w:r>
+    </w:p>
+    <w:p>
+      <w:pPr>
+        <w:pStyle w:val="Heading1"/>
+        <w:spacing w:after="140" w:before="360"/>
+      </w:pPr>
+      <w:r>
+        <w:rPr>
+          <w:b/>
+          <w:bCs/>
+          <w:color w:val="1F7A4D"/>
+          <w:sz w:val="30"/>
+          <w:szCs w:val="30"/>
+        </w:rPr>
+        <w:t xml:space="preserve">Appendix A — Calculation Glossary</w:t>
+      </w:r>
+    </w:p>
+    <w:p>
+      <w:pPr>
+        <w:spacing w:after="120" w:line="276"/>
+      </w:pPr>
+      <w:r>
+        <w:rPr>
+          <w:sz w:val="22"/>
+          <w:szCs w:val="22"/>
+        </w:rPr>
+        <w:t xml:space="preserve">A concise explanation of each financial metric, its formula, and an example figure (referencing the sample project in Section 7: contract value Rp 1,000,000,000 VAT-inclusive at 11%).</w:t>
+      </w:r>
+    </w:p>
+    <w:tbl>
+      <w:tblPr>
+        <w:tblW w:type="pct" w:w="100%"/>
+        <w:tblBorders>
+          <w:top w:val="single" w:color="CCCCCC" w:sz="4"/>
+          <w:left w:val="single" w:color="CCCCCC" w:sz="4"/>
+          <w:bottom w:val="single" w:color="CCCCCC" w:sz="4"/>
+          <w:right w:val="single" w:color="CCCCCC" w:sz="4"/>
+          <w:insideH w:val="single" w:color="DDDDDD" w:sz="2"/>
+          <w:insideV w:val="single" w:color="DDDDDD" w:sz="2"/>
+        </w:tblBorders>
+      </w:tblPr>
+      <w:tblGrid>
+        <w:gridCol w:w="100"/>
+        <w:gridCol w:w="100"/>
+        <w:gridCol w:w="100"/>
+        <w:gridCol w:w="100"/>
+      </w:tblGrid>
+      <w:tr>
+        <w:trPr>
+          <w:tblHeader/>
+        </w:trPr>
+        <w:tc>
+          <w:tcPr>
+            <w:tcW w:type="pct" w:w="17%"/>
+            <w:shd w:fill="1F7A4D"/>
+            <w:tcMar>
+              <w:top w:type="dxa" w:w="60"/>
+              <w:left w:type="dxa" w:w="90"/>
+              <w:bottom w:type="dxa" w:w="60"/>
+              <w:right w:type="dxa" w:w="90"/>
+            </w:tcMar>
+          </w:tcPr>
+          <w:p>
+            <w:r>
+              <w:rPr>
+                <w:b/>
+                <w:bCs/>
+                <w:color w:val="FFFFFF"/>
+                <w:sz w:val="20"/>
+                <w:szCs w:val="20"/>
+              </w:rPr>
+              <w:t xml:space="preserve">Term</w:t>
+            </w:r>
+          </w:p>
+        </w:tc>
+        <w:tc>
+          <w:tcPr>
+            <w:tcW w:type="pct" w:w="33%"/>
+            <w:shd w:fill="1F7A4D"/>
+            <w:tcMar>
+              <w:top w:type="dxa" w:w="60"/>
+              <w:left w:type="dxa" w:w="90"/>
+              <w:bottom w:type="dxa" w:w="60"/>
+              <w:right w:type="dxa" w:w="90"/>
+            </w:tcMar>
+          </w:tcPr>
+          <w:p>
+            <w:r>
+              <w:rPr>
+                <w:b/>
+                <w:bCs/>
+                <w:color w:val="FFFFFF"/>
+                <w:sz w:val="20"/>
+                <w:szCs w:val="20"/>
+              </w:rPr>
+              <w:t xml:space="preserve">Meaning</w:t>
+            </w:r>
+          </w:p>
+        </w:tc>
+        <w:tc>
+          <w:tcPr>
+            <w:tcW w:type="pct" w:w="30%"/>
+            <w:shd w:fill="1F7A4D"/>
+            <w:tcMar>
+              <w:top w:type="dxa" w:w="60"/>
+              <w:left w:type="dxa" w:w="90"/>
+              <w:bottom w:type="dxa" w:w="60"/>
+              <w:right w:type="dxa" w:w="90"/>
+            </w:tcMar>
+          </w:tcPr>
+          <w:p>
+            <w:r>
+              <w:rPr>
+                <w:b/>
+                <w:bCs/>
+                <w:color w:val="FFFFFF"/>
+                <w:sz w:val="20"/>
+                <w:szCs w:val="20"/>
+              </w:rPr>
+              <w:t xml:space="preserve">Formula</w:t>
+            </w:r>
+          </w:p>
+        </w:tc>
+        <w:tc>
+          <w:tcPr>
+            <w:tcW w:type="pct" w:w="20%"/>
+            <w:shd w:fill="1F7A4D"/>
+            <w:tcMar>
+              <w:top w:type="dxa" w:w="60"/>
+              <w:left w:type="dxa" w:w="90"/>
+              <w:bottom w:type="dxa" w:w="60"/>
+              <w:right w:type="dxa" w:w="90"/>
+            </w:tcMar>
+          </w:tcPr>
+          <w:p>
+            <w:r>
+              <w:rPr>
+                <w:b/>
+                <w:bCs/>
+                <w:color w:val="FFFFFF"/>
+                <w:sz w:val="20"/>
+                <w:szCs w:val="20"/>
+              </w:rPr>
+              <w:t xml:space="preserve">Example</w:t>
+            </w:r>
+          </w:p>
+        </w:tc>
+      </w:tr>
+      <w:tr>
+        <w:tc>
+          <w:tcPr>
+            <w:tcW w:type="pct" w:w="17%"/>
+            <w:tcMar>
+              <w:top w:type="dxa" w:w="60"/>
+              <w:left w:type="dxa" w:w="90"/>
+              <w:bottom w:type="dxa" w:w="60"/>
+              <w:right w:type="dxa" w:w="90"/>
+            </w:tcMar>
+          </w:tcPr>
+          <w:p>
+            <w:r>
+              <w:rPr>
+                <w:color w:val="0F1B14"/>
+                <w:sz w:val="20"/>
+                <w:szCs w:val="20"/>
+              </w:rPr>
+              <w:t xml:space="preserve">resourceCost</w:t>
+            </w:r>
+          </w:p>
+        </w:tc>
+        <w:tc>
+          <w:tcPr>
+            <w:tcW w:type="pct" w:w="33%"/>
+            <w:tcMar>
+              <w:top w:type="dxa" w:w="60"/>
+              <w:left w:type="dxa" w:w="90"/>
+              <w:bottom w:type="dxa" w:w="60"/>
+              <w:right w:type="dxa" w:w="90"/>
+            </w:tcMar>
+          </w:tcPr>
+          <w:p>
+            <w:r>
+              <w:rPr>
+                <w:color w:val="0F1B14"/>
+                <w:sz w:val="20"/>
+                <w:szCs w:val="20"/>
+              </w:rPr>
+              <w:t xml:space="preserve">Approved consultant labor cost</w:t>
+            </w:r>
+          </w:p>
+        </w:tc>
+        <w:tc>
+          <w:tcPr>
+            <w:tcW w:type="pct" w:w="30%"/>
+            <w:tcMar>
+              <w:top w:type="dxa" w:w="60"/>
+              <w:left w:type="dxa" w:w="90"/>
+              <w:bottom w:type="dxa" w:w="60"/>
+              <w:right w:type="dxa" w:w="90"/>
+            </w:tcMar>
+          </w:tcPr>
+          <w:p>
+            <w:r>
+              <w:rPr>
+                <w:color w:val="0F1B14"/>
+                <w:sz w:val="20"/>
+                <w:szCs w:val="20"/>
+              </w:rPr>
+              <w:t xml:space="preserve">SUM(hours / 8 x daily rate)</w:t>
+            </w:r>
+          </w:p>
+        </w:tc>
+        <w:tc>
+          <w:tcPr>
+            <w:tcW w:type="pct" w:w="20%"/>
+            <w:tcMar>
+              <w:top w:type="dxa" w:w="60"/>
+              <w:left w:type="dxa" w:w="90"/>
+              <w:bottom w:type="dxa" w:w="60"/>
+              <w:right w:type="dxa" w:w="90"/>
+            </w:tcMar>
+          </w:tcPr>
+          <w:p>
+            <w:r>
+              <w:rPr>
+                <w:color w:val="0F1B14"/>
+                <w:sz w:val="20"/>
+                <w:szCs w:val="20"/>
+              </w:rPr>
+              <w:t xml:space="preserve">Rp 110,000,000</w:t>
+            </w:r>
+          </w:p>
+        </w:tc>
+      </w:tr>
+      <w:tr>
+        <w:tc>
+          <w:tcPr>
+            <w:tcW w:type="pct" w:w="17%"/>
+            <w:shd w:fill="F1F6F2"/>
+            <w:tcMar>
+              <w:top w:type="dxa" w:w="60"/>
+              <w:left w:type="dxa" w:w="90"/>
+              <w:bottom w:type="dxa" w:w="60"/>
+              <w:right w:type="dxa" w:w="90"/>
+            </w:tcMar>
+          </w:tcPr>
+          <w:p>
+            <w:r>
+              <w:rPr>
+                <w:color w:val="0F1B14"/>
+                <w:sz w:val="20"/>
+                <w:szCs w:val="20"/>
+              </w:rPr>
+              <w:t xml:space="preserve">additionalCost</w:t>
+            </w:r>
+          </w:p>
+        </w:tc>
+        <w:tc>
+          <w:tcPr>
+            <w:tcW w:type="pct" w:w="33%"/>
+            <w:shd w:fill="F1F6F2"/>
+            <w:tcMar>
+              <w:top w:type="dxa" w:w="60"/>
+              <w:left w:type="dxa" w:w="90"/>
+              <w:bottom w:type="dxa" w:w="60"/>
+              <w:right w:type="dxa" w:w="90"/>
+            </w:tcMar>
+          </w:tcPr>
+          <w:p>
+            <w:r>
+              <w:rPr>
+                <w:color w:val="0F1B14"/>
+                <w:sz w:val="20"/>
+                <w:szCs w:val="20"/>
+              </w:rPr>
+              <w:t xml:space="preserve">Approved non-labor cost (license, software, etc.)</w:t>
+            </w:r>
+          </w:p>
+        </w:tc>
+        <w:tc>
+          <w:tcPr>
+            <w:tcW w:type="pct" w:w="30%"/>
+            <w:shd w:fill="F1F6F2"/>
+            <w:tcMar>
+              <w:top w:type="dxa" w:w="60"/>
+              <w:left w:type="dxa" w:w="90"/>
+              <w:bottom w:type="dxa" w:w="60"/>
+              <w:right w:type="dxa" w:w="90"/>
+            </w:tcMar>
+          </w:tcPr>
+          <w:p>
+            <w:r>
+              <w:rPr>
+                <w:color w:val="0F1B14"/>
+                <w:sz w:val="20"/>
+                <w:szCs w:val="20"/>
+              </w:rPr>
+              <w:t xml:space="preserve">SUM(amount) APPROVED</w:t>
+            </w:r>
+          </w:p>
+        </w:tc>
+        <w:tc>
+          <w:tcPr>
+            <w:tcW w:type="pct" w:w="20%"/>
+            <w:shd w:fill="F1F6F2"/>
+            <w:tcMar>
+              <w:top w:type="dxa" w:w="60"/>
+              <w:left w:type="dxa" w:w="90"/>
+              <w:bottom w:type="dxa" w:w="60"/>
+              <w:right w:type="dxa" w:w="90"/>
+            </w:tcMar>
+          </w:tcPr>
+          <w:p>
+            <w:r>
+              <w:rPr>
+                <w:color w:val="0F1B14"/>
+                <w:sz w:val="20"/>
+                <w:szCs w:val="20"/>
+              </w:rPr>
+              <w:t xml:space="preserve">Rp 20,000,000</w:t>
+            </w:r>
+          </w:p>
+        </w:tc>
+      </w:tr>
+      <w:tr>
+        <w:tc>
+          <w:tcPr>
+            <w:tcW w:type="pct" w:w="17%"/>
+            <w:tcMar>
+              <w:top w:type="dxa" w:w="60"/>
+              <w:left w:type="dxa" w:w="90"/>
+              <w:bottom w:type="dxa" w:w="60"/>
+              <w:right w:type="dxa" w:w="90"/>
+            </w:tcMar>
+          </w:tcPr>
+          <w:p>
+            <w:r>
+              <w:rPr>
+                <w:color w:val="0F1B14"/>
+                <w:sz w:val="20"/>
+                <w:szCs w:val="20"/>
+              </w:rPr>
+              <w:t xml:space="preserve">actualCost</w:t>
+            </w:r>
+          </w:p>
+        </w:tc>
+        <w:tc>
+          <w:tcPr>
+            <w:tcW w:type="pct" w:w="33%"/>
+            <w:tcMar>
+              <w:top w:type="dxa" w:w="60"/>
+              <w:left w:type="dxa" w:w="90"/>
+              <w:bottom w:type="dxa" w:w="60"/>
+              <w:right w:type="dxa" w:w="90"/>
+            </w:tcMar>
+          </w:tcPr>
+          <w:p>
+            <w:r>
+              <w:rPr>
+                <w:color w:val="0F1B14"/>
+                <w:sz w:val="20"/>
+                <w:szCs w:val="20"/>
+              </w:rPr>
+              <w:t xml:space="preserve">Total real project cost</w:t>
+            </w:r>
+          </w:p>
+        </w:tc>
+        <w:tc>
+          <w:tcPr>
+            <w:tcW w:type="pct" w:w="30%"/>
+            <w:tcMar>
+              <w:top w:type="dxa" w:w="60"/>
+              <w:left w:type="dxa" w:w="90"/>
+              <w:bottom w:type="dxa" w:w="60"/>
+              <w:right w:type="dxa" w:w="90"/>
+            </w:tcMar>
+          </w:tcPr>
+          <w:p>
+            <w:r>
+              <w:rPr>
+                <w:color w:val="0F1B14"/>
+                <w:sz w:val="20"/>
+                <w:szCs w:val="20"/>
+              </w:rPr>
+              <w:t xml:space="preserve">resourceCost + additionalCost</w:t>
+            </w:r>
+          </w:p>
+        </w:tc>
+        <w:tc>
+          <w:tcPr>
+            <w:tcW w:type="pct" w:w="20%"/>
+            <w:tcMar>
+              <w:top w:type="dxa" w:w="60"/>
+              <w:left w:type="dxa" w:w="90"/>
+              <w:bottom w:type="dxa" w:w="60"/>
+              <w:right w:type="dxa" w:w="90"/>
+            </w:tcMar>
+          </w:tcPr>
+          <w:p>
+            <w:r>
+              <w:rPr>
+                <w:color w:val="0F1B14"/>
+                <w:sz w:val="20"/>
+                <w:szCs w:val="20"/>
+              </w:rPr>
+              <w:t xml:space="preserve">Rp 130,000,000</w:t>
+            </w:r>
+          </w:p>
+        </w:tc>
+      </w:tr>
+      <w:tr>
+        <w:tc>
+          <w:tcPr>
+            <w:tcW w:type="pct" w:w="17%"/>
+            <w:shd w:fill="F1F6F2"/>
+            <w:tcMar>
+              <w:top w:type="dxa" w:w="60"/>
+              <w:left w:type="dxa" w:w="90"/>
+              <w:bottom w:type="dxa" w:w="60"/>
+              <w:right w:type="dxa" w:w="90"/>
+            </w:tcMar>
+          </w:tcPr>
+          <w:p>
+            <w:r>
+              <w:rPr>
+                <w:color w:val="0F1B14"/>
+                <w:sz w:val="20"/>
+                <w:szCs w:val="20"/>
+              </w:rPr>
+              <w:t xml:space="preserve">actualProfit</w:t>
+            </w:r>
+          </w:p>
+        </w:tc>
+        <w:tc>
+          <w:tcPr>
+            <w:tcW w:type="pct" w:w="33%"/>
+            <w:shd w:fill="F1F6F2"/>
+            <w:tcMar>
+              <w:top w:type="dxa" w:w="60"/>
+              <w:left w:type="dxa" w:w="90"/>
+              <w:bottom w:type="dxa" w:w="60"/>
+              <w:right w:type="dxa" w:w="90"/>
+            </w:tcMar>
+          </w:tcPr>
+          <w:p>
+            <w:r>
+              <w:rPr>
+                <w:color w:val="0F1B14"/>
+                <w:sz w:val="20"/>
+                <w:szCs w:val="20"/>
+              </w:rPr>
+              <w:t xml:space="preserve">Profit after actual cost</w:t>
+            </w:r>
+          </w:p>
+        </w:tc>
+        <w:tc>
+          <w:tcPr>
+            <w:tcW w:type="pct" w:w="30%"/>
+            <w:shd w:fill="F1F6F2"/>
+            <w:tcMar>
+              <w:top w:type="dxa" w:w="60"/>
+              <w:left w:type="dxa" w:w="90"/>
+              <w:bottom w:type="dxa" w:w="60"/>
+              <w:right w:type="dxa" w:w="90"/>
+            </w:tcMar>
+          </w:tcPr>
+          <w:p>
+            <w:r>
+              <w:rPr>
+                <w:color w:val="0F1B14"/>
+                <w:sz w:val="20"/>
+                <w:szCs w:val="20"/>
+              </w:rPr>
+              <w:t xml:space="preserve">contractValue - actualCost</w:t>
+            </w:r>
+          </w:p>
+        </w:tc>
+        <w:tc>
+          <w:tcPr>
+            <w:tcW w:type="pct" w:w="20%"/>
+            <w:shd w:fill="F1F6F2"/>
+            <w:tcMar>
+              <w:top w:type="dxa" w:w="60"/>
+              <w:left w:type="dxa" w:w="90"/>
+              <w:bottom w:type="dxa" w:w="60"/>
+              <w:right w:type="dxa" w:w="90"/>
+            </w:tcMar>
+          </w:tcPr>
+          <w:p>
+            <w:r>
+              <w:rPr>
+                <w:color w:val="0F1B14"/>
+                <w:sz w:val="20"/>
+                <w:szCs w:val="20"/>
+              </w:rPr>
+              <w:t xml:space="preserve">Rp 870,000,000</w:t>
+            </w:r>
+          </w:p>
+        </w:tc>
+      </w:tr>
+      <w:tr>
+        <w:tc>
+          <w:tcPr>
+            <w:tcW w:type="pct" w:w="17%"/>
+            <w:tcMar>
+              <w:top w:type="dxa" w:w="60"/>
+              <w:left w:type="dxa" w:w="90"/>
+              <w:bottom w:type="dxa" w:w="60"/>
+              <w:right w:type="dxa" w:w="90"/>
+            </w:tcMar>
+          </w:tcPr>
+          <w:p>
+            <w:r>
+              <w:rPr>
+                <w:color w:val="0F1B14"/>
+                <w:sz w:val="20"/>
+                <w:szCs w:val="20"/>
+              </w:rPr>
+              <w:t xml:space="preserve">marginPct</w:t>
+            </w:r>
+          </w:p>
+        </w:tc>
+        <w:tc>
+          <w:tcPr>
+            <w:tcW w:type="pct" w:w="33%"/>
+            <w:tcMar>
+              <w:top w:type="dxa" w:w="60"/>
+              <w:left w:type="dxa" w:w="90"/>
+              <w:bottom w:type="dxa" w:w="60"/>
+              <w:right w:type="dxa" w:w="90"/>
+            </w:tcMar>
+          </w:tcPr>
+          <w:p>
+            <w:r>
+              <w:rPr>
+                <w:color w:val="0F1B14"/>
+                <w:sz w:val="20"/>
+                <w:szCs w:val="20"/>
+              </w:rPr>
+              <w:t xml:space="preserve">Margin vs contract value (%)</w:t>
+            </w:r>
+          </w:p>
+        </w:tc>
+        <w:tc>
+          <w:tcPr>
+            <w:tcW w:type="pct" w:w="30%"/>
+            <w:tcMar>
+              <w:top w:type="dxa" w:w="60"/>
+              <w:left w:type="dxa" w:w="90"/>
+              <w:bottom w:type="dxa" w:w="60"/>
+              <w:right w:type="dxa" w:w="90"/>
+            </w:tcMar>
+          </w:tcPr>
+          <w:p>
+            <w:r>
+              <w:rPr>
+                <w:color w:val="0F1B14"/>
+                <w:sz w:val="20"/>
+                <w:szCs w:val="20"/>
+              </w:rPr>
+              <w:t xml:space="preserve">actualProfit / contractValue x 100</w:t>
+            </w:r>
+          </w:p>
+        </w:tc>
+        <w:tc>
+          <w:tcPr>
+            <w:tcW w:type="pct" w:w="20%"/>
+            <w:tcMar>
+              <w:top w:type="dxa" w:w="60"/>
+              <w:left w:type="dxa" w:w="90"/>
+              <w:bottom w:type="dxa" w:w="60"/>
+              <w:right w:type="dxa" w:w="90"/>
+            </w:tcMar>
+          </w:tcPr>
+          <w:p>
+            <w:r>
+              <w:rPr>
+                <w:color w:val="0F1B14"/>
+                <w:sz w:val="20"/>
+                <w:szCs w:val="20"/>
+              </w:rPr>
+              <w:t xml:space="preserve">87.0%</w:t>
+            </w:r>
+          </w:p>
+        </w:tc>
+      </w:tr>
+      <w:tr>
+        <w:tc>
+          <w:tcPr>
+            <w:tcW w:type="pct" w:w="17%"/>
+            <w:shd w:fill="F1F6F2"/>
+            <w:tcMar>
+              <w:top w:type="dxa" w:w="60"/>
+              <w:left w:type="dxa" w:w="90"/>
+              <w:bottom w:type="dxa" w:w="60"/>
+              <w:right w:type="dxa" w:w="90"/>
+            </w:tcMar>
+          </w:tcPr>
+          <w:p>
+            <w:r>
+              <w:rPr>
+                <w:color w:val="0F1B14"/>
+                <w:sz w:val="20"/>
+                <w:szCs w:val="20"/>
+              </w:rPr>
+              <w:t xml:space="preserve">DPP (revenueNet)</w:t>
+            </w:r>
+          </w:p>
+        </w:tc>
+        <w:tc>
+          <w:tcPr>
+            <w:tcW w:type="pct" w:w="33%"/>
+            <w:shd w:fill="F1F6F2"/>
+            <w:tcMar>
+              <w:top w:type="dxa" w:w="60"/>
+              <w:left w:type="dxa" w:w="90"/>
+              <w:bottom w:type="dxa" w:w="60"/>
+              <w:right w:type="dxa" w:w="90"/>
+            </w:tcMar>
+          </w:tcPr>
+          <w:p>
+            <w:r>
+              <w:rPr>
+                <w:color w:val="0F1B14"/>
+                <w:sz w:val="20"/>
+                <w:szCs w:val="20"/>
+              </w:rPr>
+              <w:t xml:space="preserve">Net revenue excluding VAT</w:t>
+            </w:r>
+          </w:p>
+        </w:tc>
+        <w:tc>
+          <w:tcPr>
+            <w:tcW w:type="pct" w:w="30%"/>
+            <w:shd w:fill="F1F6F2"/>
+            <w:tcMar>
+              <w:top w:type="dxa" w:w="60"/>
+              <w:left w:type="dxa" w:w="90"/>
+              <w:bottom w:type="dxa" w:w="60"/>
+              <w:right w:type="dxa" w:w="90"/>
+            </w:tcMar>
+          </w:tcPr>
+          <w:p>
+            <w:r>
+              <w:rPr>
+                <w:color w:val="0F1B14"/>
+                <w:sz w:val="20"/>
+                <w:szCs w:val="20"/>
+              </w:rPr>
+              <w:t xml:space="preserve">value / 1.11 (inclusive)</w:t>
+            </w:r>
+          </w:p>
+        </w:tc>
+        <w:tc>
+          <w:tcPr>
+            <w:tcW w:type="pct" w:w="20%"/>
+            <w:shd w:fill="F1F6F2"/>
+            <w:tcMar>
+              <w:top w:type="dxa" w:w="60"/>
+              <w:left w:type="dxa" w:w="90"/>
+              <w:bottom w:type="dxa" w:w="60"/>
+              <w:right w:type="dxa" w:w="90"/>
+            </w:tcMar>
+          </w:tcPr>
+          <w:p>
+            <w:r>
+              <w:rPr>
+                <w:color w:val="0F1B14"/>
+                <w:sz w:val="20"/>
+                <w:szCs w:val="20"/>
+              </w:rPr>
+              <w:t xml:space="preserve">Rp 900,900,900.90</w:t>
+            </w:r>
+          </w:p>
+        </w:tc>
+      </w:tr>
+      <w:tr>
+        <w:tc>
+          <w:tcPr>
+            <w:tcW w:type="pct" w:w="17%"/>
+            <w:tcMar>
+              <w:top w:type="dxa" w:w="60"/>
+              <w:left w:type="dxa" w:w="90"/>
+              <w:bottom w:type="dxa" w:w="60"/>
+              <w:right w:type="dxa" w:w="90"/>
+            </w:tcMar>
+          </w:tcPr>
+          <w:p>
+            <w:r>
+              <w:rPr>
+                <w:color w:val="0F1B14"/>
+                <w:sz w:val="20"/>
+                <w:szCs w:val="20"/>
+              </w:rPr>
+              <w:t xml:space="preserve">VAT (PPN)</w:t>
+            </w:r>
+          </w:p>
+        </w:tc>
+        <w:tc>
+          <w:tcPr>
+            <w:tcW w:type="pct" w:w="33%"/>
+            <w:tcMar>
+              <w:top w:type="dxa" w:w="60"/>
+              <w:left w:type="dxa" w:w="90"/>
+              <w:bottom w:type="dxa" w:w="60"/>
+              <w:right w:type="dxa" w:w="90"/>
+            </w:tcMar>
+          </w:tcPr>
+          <w:p>
+            <w:r>
+              <w:rPr>
+                <w:color w:val="0F1B14"/>
+                <w:sz w:val="20"/>
+                <w:szCs w:val="20"/>
+              </w:rPr>
+              <w:t xml:space="preserve">Tax embedded in the contract value</w:t>
+            </w:r>
+          </w:p>
+        </w:tc>
+        <w:tc>
+          <w:tcPr>
+            <w:tcW w:type="pct" w:w="30%"/>
+            <w:tcMar>
+              <w:top w:type="dxa" w:w="60"/>
+              <w:left w:type="dxa" w:w="90"/>
+              <w:bottom w:type="dxa" w:w="60"/>
+              <w:right w:type="dxa" w:w="90"/>
+            </w:tcMar>
+          </w:tcPr>
+          <w:p>
+            <w:r>
+              <w:rPr>
+                <w:color w:val="0F1B14"/>
+                <w:sz w:val="20"/>
+                <w:szCs w:val="20"/>
+              </w:rPr>
+              <w:t xml:space="preserve">value - DPP</w:t>
+            </w:r>
+          </w:p>
+        </w:tc>
+        <w:tc>
+          <w:tcPr>
+            <w:tcW w:type="pct" w:w="20%"/>
+            <w:tcMar>
+              <w:top w:type="dxa" w:w="60"/>
+              <w:left w:type="dxa" w:w="90"/>
+              <w:bottom w:type="dxa" w:w="60"/>
+              <w:right w:type="dxa" w:w="90"/>
+            </w:tcMar>
+          </w:tcPr>
+          <w:p>
+            <w:r>
+              <w:rPr>
+                <w:color w:val="0F1B14"/>
+                <w:sz w:val="20"/>
+                <w:szCs w:val="20"/>
+              </w:rPr>
+              <w:t xml:space="preserve">Rp 99,099,099.10</w:t>
+            </w:r>
+          </w:p>
+        </w:tc>
+      </w:tr>
+      <w:tr>
+        <w:tc>
+          <w:tcPr>
+            <w:tcW w:type="pct" w:w="17%"/>
+            <w:shd w:fill="F1F6F2"/>
+            <w:tcMar>
+              <w:top w:type="dxa" w:w="60"/>
+              <w:left w:type="dxa" w:w="90"/>
+              <w:bottom w:type="dxa" w:w="60"/>
+              <w:right w:type="dxa" w:w="90"/>
+            </w:tcMar>
+          </w:tcPr>
+          <w:p>
+            <w:r>
+              <w:rPr>
+                <w:color w:val="0F1B14"/>
+                <w:sz w:val="20"/>
+                <w:szCs w:val="20"/>
+              </w:rPr>
+              <w:t xml:space="preserve">burnRatePct</w:t>
+            </w:r>
+          </w:p>
+        </w:tc>
+        <w:tc>
+          <w:tcPr>
+            <w:tcW w:type="pct" w:w="33%"/>
+            <w:shd w:fill="F1F6F2"/>
+            <w:tcMar>
+              <w:top w:type="dxa" w:w="60"/>
+              <w:left w:type="dxa" w:w="90"/>
+              <w:bottom w:type="dxa" w:w="60"/>
+              <w:right w:type="dxa" w:w="90"/>
+            </w:tcMar>
+          </w:tcPr>
+          <w:p>
+            <w:r>
+              <w:rPr>
+                <w:color w:val="0F1B14"/>
+                <w:sz w:val="20"/>
+                <w:szCs w:val="20"/>
+              </w:rPr>
+              <w:t xml:space="preserve">Completion (actual vs planned mandays, max 100%)</w:t>
+            </w:r>
+          </w:p>
+        </w:tc>
+        <w:tc>
+          <w:tcPr>
+            <w:tcW w:type="pct" w:w="30%"/>
+            <w:shd w:fill="F1F6F2"/>
+            <w:tcMar>
+              <w:top w:type="dxa" w:w="60"/>
+              <w:left w:type="dxa" w:w="90"/>
+              <w:bottom w:type="dxa" w:w="60"/>
+              <w:right w:type="dxa" w:w="90"/>
+            </w:tcMar>
+          </w:tcPr>
+          <w:p>
+            <w:r>
+              <w:rPr>
+                <w:color w:val="0F1B14"/>
+                <w:sz w:val="20"/>
+                <w:szCs w:val="20"/>
+              </w:rPr>
+              <w:t xml:space="preserve">min(actualMandays / plannedMandays x 100, 100)</w:t>
+            </w:r>
+          </w:p>
+        </w:tc>
+        <w:tc>
+          <w:tcPr>
+            <w:tcW w:type="pct" w:w="20%"/>
+            <w:shd w:fill="F1F6F2"/>
+            <w:tcMar>
+              <w:top w:type="dxa" w:w="60"/>
+              <w:left w:type="dxa" w:w="90"/>
+              <w:bottom w:type="dxa" w:w="60"/>
+              <w:right w:type="dxa" w:w="90"/>
+            </w:tcMar>
+          </w:tcPr>
+          <w:p>
+            <w:r>
+              <w:rPr>
+                <w:color w:val="0F1B14"/>
+                <w:sz w:val="20"/>
+                <w:szCs w:val="20"/>
+              </w:rPr>
+              <w:t xml:space="preserve">60%</w:t>
+            </w:r>
+          </w:p>
+        </w:tc>
+      </w:tr>
+      <w:tr>
+        <w:tc>
+          <w:tcPr>
+            <w:tcW w:type="pct" w:w="17%"/>
+            <w:tcMar>
+              <w:top w:type="dxa" w:w="60"/>
+              <w:left w:type="dxa" w:w="90"/>
+              <w:bottom w:type="dxa" w:w="60"/>
+              <w:right w:type="dxa" w:w="90"/>
+            </w:tcMar>
+          </w:tcPr>
+          <w:p>
+            <w:r>
+              <w:rPr>
+                <w:color w:val="0F1B14"/>
+                <w:sz w:val="20"/>
+                <w:szCs w:val="20"/>
+              </w:rPr>
+              <w:t xml:space="preserve">recognizedRevenue</w:t>
+            </w:r>
+          </w:p>
+        </w:tc>
+        <w:tc>
+          <w:tcPr>
+            <w:tcW w:type="pct" w:w="33%"/>
+            <w:tcMar>
+              <w:top w:type="dxa" w:w="60"/>
+              <w:left w:type="dxa" w:w="90"/>
+              <w:bottom w:type="dxa" w:w="60"/>
+              <w:right w:type="dxa" w:w="90"/>
+            </w:tcMar>
+          </w:tcPr>
+          <w:p>
+            <w:r>
+              <w:rPr>
+                <w:color w:val="0F1B14"/>
+                <w:sz w:val="20"/>
+                <w:szCs w:val="20"/>
+              </w:rPr>
+              <w:t xml:space="preserve">Revenue recognized by progress (PSAK 72)</w:t>
+            </w:r>
+          </w:p>
+        </w:tc>
+        <w:tc>
+          <w:tcPr>
+            <w:tcW w:type="pct" w:w="30%"/>
+            <w:tcMar>
+              <w:top w:type="dxa" w:w="60"/>
+              <w:left w:type="dxa" w:w="90"/>
+              <w:bottom w:type="dxa" w:w="60"/>
+              <w:right w:type="dxa" w:w="90"/>
+            </w:tcMar>
+          </w:tcPr>
+          <w:p>
+            <w:r>
+              <w:rPr>
+                <w:color w:val="0F1B14"/>
+                <w:sz w:val="20"/>
+                <w:szCs w:val="20"/>
+              </w:rPr>
+              <w:t xml:space="preserve">burnRatePct x DPP</w:t>
+            </w:r>
+          </w:p>
+        </w:tc>
+        <w:tc>
+          <w:tcPr>
+            <w:tcW w:type="pct" w:w="20%"/>
+            <w:tcMar>
+              <w:top w:type="dxa" w:w="60"/>
+              <w:left w:type="dxa" w:w="90"/>
+              <w:bottom w:type="dxa" w:w="60"/>
+              <w:right w:type="dxa" w:w="90"/>
+            </w:tcMar>
+          </w:tcPr>
+          <w:p>
+            <w:r>
+              <w:rPr>
+                <w:color w:val="0F1B14"/>
+                <w:sz w:val="20"/>
+                <w:szCs w:val="20"/>
+              </w:rPr>
+              <w:t xml:space="preserve">Rp 540,540,540.54</w:t>
+            </w:r>
+          </w:p>
+        </w:tc>
+      </w:tr>
+      <w:tr>
+        <w:tc>
+          <w:tcPr>
+            <w:tcW w:type="pct" w:w="17%"/>
+            <w:shd w:fill="F1F6F2"/>
+            <w:tcMar>
+              <w:top w:type="dxa" w:w="60"/>
+              <w:left w:type="dxa" w:w="90"/>
+              <w:bottom w:type="dxa" w:w="60"/>
+              <w:right w:type="dxa" w:w="90"/>
+            </w:tcMar>
+          </w:tcPr>
+          <w:p>
+            <w:r>
+              <w:rPr>
+                <w:color w:val="0F1B14"/>
+                <w:sz w:val="20"/>
+                <w:szCs w:val="20"/>
+              </w:rPr>
+              <w:t xml:space="preserve">loadedResourceCost</w:t>
+            </w:r>
+          </w:p>
+        </w:tc>
+        <w:tc>
+          <w:tcPr>
+            <w:tcW w:type="pct" w:w="33%"/>
+            <w:shd w:fill="F1F6F2"/>
+            <w:tcMar>
+              <w:top w:type="dxa" w:w="60"/>
+              <w:left w:type="dxa" w:w="90"/>
+              <w:bottom w:type="dxa" w:w="60"/>
+              <w:right w:type="dxa" w:w="90"/>
+            </w:tcMar>
+          </w:tcPr>
+          <w:p>
+            <w:r>
+              <w:rPr>
+                <w:color w:val="0F1B14"/>
+                <w:sz w:val="20"/>
+                <w:szCs w:val="20"/>
+              </w:rPr>
+              <w:t xml:space="preserve">Labor cost after overhead loading</w:t>
+            </w:r>
+          </w:p>
+        </w:tc>
+        <w:tc>
+          <w:tcPr>
+            <w:tcW w:type="pct" w:w="30%"/>
+            <w:shd w:fill="F1F6F2"/>
+            <w:tcMar>
+              <w:top w:type="dxa" w:w="60"/>
+              <w:left w:type="dxa" w:w="90"/>
+              <w:bottom w:type="dxa" w:w="60"/>
+              <w:right w:type="dxa" w:w="90"/>
+            </w:tcMar>
+          </w:tcPr>
+          <w:p>
+            <w:r>
+              <w:rPr>
+                <w:color w:val="0F1B14"/>
+                <w:sz w:val="20"/>
+                <w:szCs w:val="20"/>
+              </w:rPr>
+              <w:t xml:space="preserve">resourceCost x overheadMultiplier</w:t>
+            </w:r>
+          </w:p>
+        </w:tc>
+        <w:tc>
+          <w:tcPr>
+            <w:tcW w:type="pct" w:w="20%"/>
+            <w:shd w:fill="F1F6F2"/>
+            <w:tcMar>
+              <w:top w:type="dxa" w:w="60"/>
+              <w:left w:type="dxa" w:w="90"/>
+              <w:bottom w:type="dxa" w:w="60"/>
+              <w:right w:type="dxa" w:w="90"/>
+            </w:tcMar>
+          </w:tcPr>
+          <w:p>
+            <w:r>
+              <w:rPr>
+                <w:color w:val="0F1B14"/>
+                <w:sz w:val="20"/>
+                <w:szCs w:val="20"/>
+              </w:rPr>
+              <w:t xml:space="preserve">Rp 143,000,000</w:t>
+            </w:r>
+          </w:p>
+        </w:tc>
+      </w:tr>
+      <w:tr>
+        <w:tc>
+          <w:tcPr>
+            <w:tcW w:type="pct" w:w="17%"/>
+            <w:tcMar>
+              <w:top w:type="dxa" w:w="60"/>
+              <w:left w:type="dxa" w:w="90"/>
+              <w:bottom w:type="dxa" w:w="60"/>
+              <w:right w:type="dxa" w:w="90"/>
+            </w:tcMar>
+          </w:tcPr>
+          <w:p>
+            <w:r>
+              <w:rPr>
+                <w:color w:val="0F1B14"/>
+                <w:sz w:val="20"/>
+                <w:szCs w:val="20"/>
+              </w:rPr>
+              <w:t xml:space="preserve">netActualCost</w:t>
+            </w:r>
+          </w:p>
+        </w:tc>
+        <w:tc>
+          <w:tcPr>
+            <w:tcW w:type="pct" w:w="33%"/>
+            <w:tcMar>
+              <w:top w:type="dxa" w:w="60"/>
+              <w:left w:type="dxa" w:w="90"/>
+              <w:bottom w:type="dxa" w:w="60"/>
+              <w:right w:type="dxa" w:w="90"/>
+            </w:tcMar>
+          </w:tcPr>
+          <w:p>
+            <w:r>
+              <w:rPr>
+                <w:color w:val="0F1B14"/>
+                <w:sz w:val="20"/>
+                <w:szCs w:val="20"/>
+              </w:rPr>
+              <w:t xml:space="preserve">Fully-loaded total cost (incl. overhead)</w:t>
+            </w:r>
+          </w:p>
+        </w:tc>
+        <w:tc>
+          <w:tcPr>
+            <w:tcW w:type="pct" w:w="30%"/>
+            <w:tcMar>
+              <w:top w:type="dxa" w:w="60"/>
+              <w:left w:type="dxa" w:w="90"/>
+              <w:bottom w:type="dxa" w:w="60"/>
+              <w:right w:type="dxa" w:w="90"/>
+            </w:tcMar>
+          </w:tcPr>
+          <w:p>
+            <w:r>
+              <w:rPr>
+                <w:color w:val="0F1B14"/>
+                <w:sz w:val="20"/>
+                <w:szCs w:val="20"/>
+              </w:rPr>
+              <w:t xml:space="preserve">loadedResourceCost + additionalCost</w:t>
+            </w:r>
+          </w:p>
+        </w:tc>
+        <w:tc>
+          <w:tcPr>
+            <w:tcW w:type="pct" w:w="20%"/>
+            <w:tcMar>
+              <w:top w:type="dxa" w:w="60"/>
+              <w:left w:type="dxa" w:w="90"/>
+              <w:bottom w:type="dxa" w:w="60"/>
+              <w:right w:type="dxa" w:w="90"/>
+            </w:tcMar>
+          </w:tcPr>
+          <w:p>
+            <w:r>
+              <w:rPr>
+                <w:color w:val="0F1B14"/>
+                <w:sz w:val="20"/>
+                <w:szCs w:val="20"/>
+              </w:rPr>
+              <w:t xml:space="preserve">Rp 163,000,000</w:t>
+            </w:r>
+          </w:p>
+        </w:tc>
+      </w:tr>
+      <w:tr>
+        <w:tc>
+          <w:tcPr>
+            <w:tcW w:type="pct" w:w="17%"/>
+            <w:shd w:fill="F1F6F2"/>
+            <w:tcMar>
+              <w:top w:type="dxa" w:w="60"/>
+              <w:left w:type="dxa" w:w="90"/>
+              <w:bottom w:type="dxa" w:w="60"/>
+              <w:right w:type="dxa" w:w="90"/>
+            </w:tcMar>
+          </w:tcPr>
+          <w:p>
+            <w:r>
+              <w:rPr>
+                <w:color w:val="0F1B14"/>
+                <w:sz w:val="20"/>
+                <w:szCs w:val="20"/>
+              </w:rPr>
+              <w:t xml:space="preserve">netActualProfit</w:t>
+            </w:r>
+          </w:p>
+        </w:tc>
+        <w:tc>
+          <w:tcPr>
+            <w:tcW w:type="pct" w:w="33%"/>
+            <w:shd w:fill="F1F6F2"/>
+            <w:tcMar>
+              <w:top w:type="dxa" w:w="60"/>
+              <w:left w:type="dxa" w:w="90"/>
+              <w:bottom w:type="dxa" w:w="60"/>
+              <w:right w:type="dxa" w:w="90"/>
+            </w:tcMar>
+          </w:tcPr>
+          <w:p>
+            <w:r>
+              <w:rPr>
+                <w:color w:val="0F1B14"/>
+                <w:sz w:val="20"/>
+                <w:szCs w:val="20"/>
+              </w:rPr>
+              <w:t xml:space="preserve">Fully-loaded net profit (vs DPP)</w:t>
+            </w:r>
+          </w:p>
+        </w:tc>
+        <w:tc>
+          <w:tcPr>
+            <w:tcW w:type="pct" w:w="30%"/>
+            <w:shd w:fill="F1F6F2"/>
+            <w:tcMar>
+              <w:top w:type="dxa" w:w="60"/>
+              <w:left w:type="dxa" w:w="90"/>
+              <w:bottom w:type="dxa" w:w="60"/>
+              <w:right w:type="dxa" w:w="90"/>
+            </w:tcMar>
+          </w:tcPr>
+          <w:p>
+            <w:r>
+              <w:rPr>
+                <w:color w:val="0F1B14"/>
+                <w:sz w:val="20"/>
+                <w:szCs w:val="20"/>
+              </w:rPr>
+              <w:t xml:space="preserve">revenueNet - netActualCost</w:t>
+            </w:r>
+          </w:p>
+        </w:tc>
+        <w:tc>
+          <w:tcPr>
+            <w:tcW w:type="pct" w:w="20%"/>
+            <w:shd w:fill="F1F6F2"/>
+            <w:tcMar>
+              <w:top w:type="dxa" w:w="60"/>
+              <w:left w:type="dxa" w:w="90"/>
+              <w:bottom w:type="dxa" w:w="60"/>
+              <w:right w:type="dxa" w:w="90"/>
+            </w:tcMar>
+          </w:tcPr>
+          <w:p>
+            <w:r>
+              <w:rPr>
+                <w:color w:val="0F1B14"/>
+                <w:sz w:val="20"/>
+                <w:szCs w:val="20"/>
+              </w:rPr>
+              <w:t xml:space="preserve">Rp 737,900,900.90</w:t>
+            </w:r>
+          </w:p>
+        </w:tc>
+      </w:tr>
+      <w:tr>
+        <w:tc>
+          <w:tcPr>
+            <w:tcW w:type="pct" w:w="17%"/>
+            <w:tcMar>
+              <w:top w:type="dxa" w:w="60"/>
+              <w:left w:type="dxa" w:w="90"/>
+              <w:bottom w:type="dxa" w:w="60"/>
+              <w:right w:type="dxa" w:w="90"/>
+            </w:tcMar>
+          </w:tcPr>
+          <w:p>
+            <w:r>
+              <w:rPr>
+                <w:color w:val="0F1B14"/>
+                <w:sz w:val="20"/>
+                <w:szCs w:val="20"/>
+              </w:rPr>
+              <w:t xml:space="preserve">netMarginPct</w:t>
+            </w:r>
+          </w:p>
+        </w:tc>
+        <w:tc>
+          <w:tcPr>
+            <w:tcW w:type="pct" w:w="33%"/>
+            <w:tcMar>
+              <w:top w:type="dxa" w:w="60"/>
+              <w:left w:type="dxa" w:w="90"/>
+              <w:bottom w:type="dxa" w:w="60"/>
+              <w:right w:type="dxa" w:w="90"/>
+            </w:tcMar>
+          </w:tcPr>
+          <w:p>
+            <w:r>
+              <w:rPr>
+                <w:color w:val="0F1B14"/>
+                <w:sz w:val="20"/>
+                <w:szCs w:val="20"/>
+              </w:rPr>
+              <w:t xml:space="preserve">Fully-loaded net margin (%)</w:t>
+            </w:r>
+          </w:p>
+        </w:tc>
+        <w:tc>
+          <w:tcPr>
+            <w:tcW w:type="pct" w:w="30%"/>
+            <w:tcMar>
+              <w:top w:type="dxa" w:w="60"/>
+              <w:left w:type="dxa" w:w="90"/>
+              <w:bottom w:type="dxa" w:w="60"/>
+              <w:right w:type="dxa" w:w="90"/>
+            </w:tcMar>
+          </w:tcPr>
+          <w:p>
+            <w:r>
+              <w:rPr>
+                <w:color w:val="0F1B14"/>
+                <w:sz w:val="20"/>
+                <w:szCs w:val="20"/>
+              </w:rPr>
+              <w:t xml:space="preserve">netActualProfit / revenueNet x 100</w:t>
+            </w:r>
+          </w:p>
+        </w:tc>
+        <w:tc>
+          <w:tcPr>
+            <w:tcW w:type="pct" w:w="20%"/>
+            <w:tcMar>
+              <w:top w:type="dxa" w:w="60"/>
+              <w:left w:type="dxa" w:w="90"/>
+              <w:bottom w:type="dxa" w:w="60"/>
+              <w:right w:type="dxa" w:w="90"/>
+            </w:tcMar>
+          </w:tcPr>
+          <w:p>
+            <w:r>
+              <w:rPr>
+                <w:color w:val="0F1B14"/>
+                <w:sz w:val="20"/>
+                <w:szCs w:val="20"/>
+              </w:rPr>
+              <w:t xml:space="preserve">81.9%</w:t>
+            </w:r>
+          </w:p>
+        </w:tc>
+      </w:tr>
+    </w:tbl>
+    <w:p>
+      <w:pPr>
+        <w:spacing w:after="120" w:line="276"/>
+      </w:pPr>
+      <w:r>
+        <w:rPr>
+          <w:b/>
+          <w:bCs/>
+          <w:sz w:val="22"/>
+          <w:szCs w:val="22"/>
+        </w:rPr>
+        <w:t xml:space="preserve">Two kinds of margin: </w:t>
+      </w:r>
+      <w:r>
+        <w:rPr>
+          <w:b w:val="false"/>
+          <w:bCs w:val="false"/>
+          <w:sz w:val="22"/>
+          <w:szCs w:val="22"/>
+        </w:rPr>
+        <w:t xml:space="preserve">marginPct (87.0%) is the quick view — gross contract value minus direct cost only. netMarginPct (81.9%) is the realistic view — net revenue (excluding VAT) minus overhead-loaded cost, so it is always lower and more honest for decision-making.</w:t>
       </w:r>
     </w:p>
     <w:sectPr>

</xml_diff>

<commit_message>
Add financial calculation explanations to project documentation
Add a glossary of financial terms and computed values to the project documentation, detailing metrics such as resourceCost, actualProfit, marginPct, and VAT.

Replit-Commit-Author: Agent
Replit-Commit-Session-Id: 0226671d-4d7c-40eb-9b18-8775578e8874
Replit-Commit-Checkpoint-Type: full_checkpoint
Replit-Commit-Event-Id: 55bbc8b4-783f-4eb2-a09e-230d2d197ae5
Replit-Commit-Screenshot-Url: https://storage.googleapis.com/screenshot-production-us-central1/c82b66a8-f4a7-47f1-bdbd-9ebba5cc2312/0226671d-4d7c-40eb-9b18-8775578e8874/JiEOTRE
Replit-Helium-Checkpoint-Created: true
</commit_message>
<xml_diff>
--- a/exports/SecureProfit-Hub-Features-and-Calculations-EN.docx
+++ b/exports/SecureProfit-Hub-Features-and-Calculations-EN.docx
@@ -6844,6 +6844,282 @@
         </w:tc>
       </w:tr>
     </w:tbl>
+    <w:p>
+      <w:pPr>
+        <w:pStyle w:val="Heading3"/>
+        <w:spacing w:before="160" w:after="70"/>
+      </w:pPr>
+      <w:r>
+        <w:rPr>
+          <w:b/>
+          <w:bCs/>
+          <w:color w:val="0F1B14"/>
+          <w:sz w:val="23"/>
+          <w:szCs w:val="23"/>
+        </w:rPr>
+        <w:t>What each figure means</w:t>
+      </w:r>
+    </w:p>
+    <w:p>
+      <w:pPr>
+        <w:pStyle w:val="ListParagraph"/>
+        <w:numPr>
+          <w:ilvl w:val="0"/>
+          <w:numId w:val="1"/>
+        </w:numPr>
+        <w:spacing w:after="60" w:line="268" w:lineRule="auto"/>
+      </w:pPr>
+      <w:r>
+        <w:rPr>
+          <w:b/>
+          <w:bCs/>
+        </w:rPr>
+        <w:t xml:space="preserve">resourceCost — </w:t>
+      </w:r>
+      <w:r>
+        <w:t>total labour cost from APPROVED timesheets: logged hours converted to man-days (hours / 8) and multiplied by each resource's daily rate.</w:t>
+      </w:r>
+    </w:p>
+    <w:p>
+      <w:pPr>
+        <w:pStyle w:val="ListParagraph"/>
+        <w:numPr>
+          <w:ilvl w:val="0"/>
+          <w:numId w:val="1"/>
+        </w:numPr>
+        <w:spacing w:after="60" w:line="268" w:lineRule="auto"/>
+      </w:pPr>
+      <w:r>
+        <w:rPr>
+          <w:b/>
+          <w:bCs/>
+        </w:rPr>
+        <w:t xml:space="preserve">additionalCost — </w:t>
+      </w:r>
+      <w:r>
+        <w:t>total of APPROVED non-labour expenses (software, hardware, license, travel, other); pending and rejected items are excluded.</w:t>
+      </w:r>
+    </w:p>
+    <w:p>
+      <w:pPr>
+        <w:pStyle w:val="ListParagraph"/>
+        <w:numPr>
+          <w:ilvl w:val="0"/>
+          <w:numId w:val="1"/>
+        </w:numPr>
+        <w:spacing w:after="60" w:line="268" w:lineRule="auto"/>
+      </w:pPr>
+      <w:r>
+        <w:rPr>
+          <w:b/>
+          <w:bCs/>
+        </w:rPr>
+        <w:t xml:space="preserve">actualCost — </w:t>
+      </w:r>
+      <w:r>
+        <w:t>the project's real cost so far, i.e. resourceCost + additionalCost.</w:t>
+      </w:r>
+    </w:p>
+    <w:p>
+      <w:pPr>
+        <w:pStyle w:val="ListParagraph"/>
+        <w:numPr>
+          <w:ilvl w:val="0"/>
+          <w:numId w:val="1"/>
+        </w:numPr>
+        <w:spacing w:after="60" w:line="268" w:lineRule="auto"/>
+      </w:pPr>
+      <w:r>
+        <w:rPr>
+          <w:b/>
+          <w:bCs/>
+        </w:rPr>
+        <w:t xml:space="preserve">actualProfit — </w:t>
+      </w:r>
+      <w:r>
+        <w:t>contract value minus actualCost; the profit booked so far, in Rupiah.</w:t>
+      </w:r>
+    </w:p>
+    <w:p>
+      <w:pPr>
+        <w:pStyle w:val="ListParagraph"/>
+        <w:numPr>
+          <w:ilvl w:val="0"/>
+          <w:numId w:val="1"/>
+        </w:numPr>
+        <w:spacing w:after="60" w:line="268" w:lineRule="auto"/>
+      </w:pPr>
+      <w:r>
+        <w:rPr>
+          <w:b/>
+          <w:bCs/>
+        </w:rPr>
+        <w:t xml:space="preserve">marginPct — </w:t>
+      </w:r>
+      <w:r>
+        <w:t>actualProfit as a percentage of the contract value; the profit margin achieved so far.</w:t>
+      </w:r>
+    </w:p>
+    <w:p>
+      <w:pPr>
+        <w:pStyle w:val="ListParagraph"/>
+        <w:numPr>
+          <w:ilvl w:val="0"/>
+          <w:numId w:val="1"/>
+        </w:numPr>
+        <w:spacing w:after="60" w:line="268" w:lineRule="auto"/>
+      </w:pPr>
+      <w:r>
+        <w:rPr>
+          <w:b/>
+          <w:bCs/>
+        </w:rPr>
+        <w:t xml:space="preserve">DPP (revenueNet) — </w:t>
+      </w:r>
+      <w:r>
+        <w:t>the taxable base, i.e. the net revenue once VAT is stripped out of the contract value.</w:t>
+      </w:r>
+    </w:p>
+    <w:p>
+      <w:pPr>
+        <w:pStyle w:val="ListParagraph"/>
+        <w:numPr>
+          <w:ilvl w:val="0"/>
+          <w:numId w:val="1"/>
+        </w:numPr>
+        <w:spacing w:after="60" w:line="268" w:lineRule="auto"/>
+      </w:pPr>
+      <w:r>
+        <w:rPr>
+          <w:b/>
+          <w:bCs/>
+        </w:rPr>
+        <w:t xml:space="preserve">VAT — </w:t>
+      </w:r>
+      <w:r>
+        <w:t>the value-added tax portion (PPN, default 11%) separated from the contract value.</w:t>
+      </w:r>
+    </w:p>
+    <w:p>
+      <w:pPr>
+        <w:pStyle w:val="ListParagraph"/>
+        <w:numPr>
+          <w:ilvl w:val="0"/>
+          <w:numId w:val="1"/>
+        </w:numPr>
+        <w:spacing w:after="60" w:line="268" w:lineRule="auto"/>
+      </w:pPr>
+      <w:r>
+        <w:rPr>
+          <w:b/>
+          <w:bCs/>
+        </w:rPr>
+        <w:t xml:space="preserve">burnRatePct — </w:t>
+      </w:r>
+      <w:r>
+        <w:t>how much of the planned work is done: actual man-days / planned man-days, capped at 100%.</w:t>
+      </w:r>
+    </w:p>
+    <w:p>
+      <w:pPr>
+        <w:pStyle w:val="ListParagraph"/>
+        <w:numPr>
+          <w:ilvl w:val="0"/>
+          <w:numId w:val="1"/>
+        </w:numPr>
+        <w:spacing w:after="60" w:line="268" w:lineRule="auto"/>
+      </w:pPr>
+      <w:r>
+        <w:rPr>
+          <w:b/>
+          <w:bCs/>
+        </w:rPr>
+        <w:t xml:space="preserve">recognizedRevenue — </w:t>
+      </w:r>
+      <w:r>
+        <w:t>revenue earned to date under the percentage-of-completion principle: burnRatePct x net revenue (DPP).</w:t>
+      </w:r>
+    </w:p>
+    <w:p>
+      <w:pPr>
+        <w:pStyle w:val="ListParagraph"/>
+        <w:numPr>
+          <w:ilvl w:val="0"/>
+          <w:numId w:val="1"/>
+        </w:numPr>
+        <w:spacing w:after="60" w:line="268" w:lineRule="auto"/>
+      </w:pPr>
+      <w:r>
+        <w:rPr>
+          <w:b/>
+          <w:bCs/>
+        </w:rPr>
+        <w:t xml:space="preserve">loadedResourceCost — </w:t>
+      </w:r>
+      <w:r>
+        <w:t>resourceCost multiplied by the overhead multiplier, so the company's indirect (overhead) costs are included.</w:t>
+      </w:r>
+    </w:p>
+    <w:p>
+      <w:pPr>
+        <w:pStyle w:val="ListParagraph"/>
+        <w:numPr>
+          <w:ilvl w:val="0"/>
+          <w:numId w:val="1"/>
+        </w:numPr>
+        <w:spacing w:after="60" w:line="268" w:lineRule="auto"/>
+      </w:pPr>
+      <w:r>
+        <w:rPr>
+          <w:b/>
+          <w:bCs/>
+        </w:rPr>
+        <w:t xml:space="preserve">netActualCost — </w:t>
+      </w:r>
+      <w:r>
+        <w:t>the fully-loaded cost: loadedResourceCost + additionalCost.</w:t>
+      </w:r>
+    </w:p>
+    <w:p>
+      <w:pPr>
+        <w:pStyle w:val="ListParagraph"/>
+        <w:numPr>
+          <w:ilvl w:val="0"/>
+          <w:numId w:val="1"/>
+        </w:numPr>
+        <w:spacing w:after="60" w:line="268" w:lineRule="auto"/>
+      </w:pPr>
+      <w:r>
+        <w:rPr>
+          <w:b/>
+          <w:bCs/>
+        </w:rPr>
+        <w:t xml:space="preserve">netActualProfit — </w:t>
+      </w:r>
+      <w:r>
+        <w:t>net revenue (DPP) minus netActualCost; profit after overhead is accounted for.</w:t>
+      </w:r>
+    </w:p>
+    <w:p>
+      <w:pPr>
+        <w:pStyle w:val="ListParagraph"/>
+        <w:numPr>
+          <w:ilvl w:val="0"/>
+          <w:numId w:val="1"/>
+        </w:numPr>
+        <w:spacing w:after="60" w:line="268" w:lineRule="auto"/>
+      </w:pPr>
+      <w:r>
+        <w:rPr>
+          <w:b/>
+          <w:bCs/>
+        </w:rPr>
+        <w:t xml:space="preserve">netMarginPct — </w:t>
+      </w:r>
+      <w:r>
+        <w:t>netActualProfit as a percentage of net revenue (DPP); the conservative, overhead-adjusted margin.</w:t>
+      </w:r>
+    </w:p>
     <w:p>
       <w:pPr>
         <w:pStyle w:val="Heading3"/>

</xml_diff>